<commit_message>
Add list styles to avoid warnings
</commit_message>
<xml_diff>
--- a/inst/csas-docx/SRR-RS2026-eng-main.docx
+++ b/inst/csas-docx/SRR-RS2026-eng-main.docx
@@ -49,23 +49,7 @@
           <w:color w:val="4F81BD" w:themeColor="accent1"/>
           <w:lang w:val="en-CA"/>
         </w:rPr>
-        <w:t xml:space="preserve">/area </w:t>
-      </w:r>
-      <w:proofErr w:type="gramStart"/>
-      <w:r>
-        <w:rPr>
-          <w:color w:val="4F81BD" w:themeColor="accent1"/>
-          <w:lang w:val="en-CA"/>
-        </w:rPr>
-        <w:t>and also</w:t>
-      </w:r>
-      <w:proofErr w:type="gramEnd"/>
-      <w:r>
-        <w:rPr>
-          <w:color w:val="4F81BD" w:themeColor="accent1"/>
-          <w:lang w:val="en-CA"/>
-        </w:rPr>
-        <w:t xml:space="preserve"> the specific issue of concern </w:t>
+        <w:t xml:space="preserve">/area and also the specific issue of concern </w:t>
       </w:r>
       <w:r>
         <w:rPr>
@@ -1583,7 +1567,6 @@
       </w:r>
       <w:bookmarkStart w:id="4" w:name="_Hlk215580570"/>
       <w:proofErr w:type="spellStart"/>
-      <w:proofErr w:type="gramStart"/>
       <w:r>
         <w:rPr>
           <w:lang w:val="fr-CA"/>
@@ -1591,7 +1574,6 @@
         <w:t>doi</w:t>
       </w:r>
       <w:proofErr w:type="spellEnd"/>
-      <w:proofErr w:type="gramEnd"/>
       <w:r>
         <w:rPr>
           <w:lang w:val="fr-CA"/>
@@ -1689,139 +1671,81 @@
         <w:rPr>
           <w:lang w:val="fr-CA"/>
         </w:rPr>
-        <w:t xml:space="preserve">Secr. </w:t>
-      </w:r>
-      <w:proofErr w:type="gramStart"/>
+        <w:t>Secr. can. des avis</w:t>
+      </w:r>
       <w:r>
         <w:rPr>
           <w:lang w:val="fr-CA"/>
         </w:rPr>
-        <w:t>can</w:t>
-      </w:r>
-      <w:proofErr w:type="gramEnd"/>
+        <w:t xml:space="preserve"> </w:t>
+      </w:r>
       <w:r>
         <w:rPr>
           <w:lang w:val="fr-CA"/>
         </w:rPr>
-        <w:t xml:space="preserve">. </w:t>
-      </w:r>
-      <w:proofErr w:type="gramStart"/>
+        <w:t xml:space="preserve">sci. </w:t>
+      </w:r>
       <w:r>
         <w:rPr>
           <w:lang w:val="fr-CA"/>
         </w:rPr>
-        <w:t>des</w:t>
-      </w:r>
-      <w:proofErr w:type="gramEnd"/>
+        <w:t>du MPO</w:t>
+      </w:r>
       <w:r>
         <w:rPr>
           <w:lang w:val="fr-CA"/>
         </w:rPr>
-        <w:t xml:space="preserve"> avis</w:t>
+        <w:t>.</w:t>
       </w:r>
       <w:r>
         <w:rPr>
           <w:lang w:val="fr-CA"/>
         </w:rPr>
+        <w:t xml:space="preserve"> Rép. des Sci. </w:t>
+      </w:r>
+      <w:r>
+        <w:rPr>
+          <w:lang w:val="fr-CA"/>
+        </w:rPr>
+        <w:t>202</w:t>
+      </w:r>
+      <w:r>
+        <w:rPr>
+          <w:lang w:val="fr-CA"/>
+        </w:rPr>
+        <w:t>6</w:t>
+      </w:r>
+      <w:r>
+        <w:rPr>
+          <w:lang w:val="fr-CA"/>
+        </w:rPr>
+        <w:t>/</w:t>
+      </w:r>
+      <w:r>
+        <w:rPr>
+          <w:color w:val="4F81BD" w:themeColor="accent1"/>
+          <w:lang w:val="fr-CA"/>
+        </w:rPr>
+        <w:t>nnn</w:t>
+      </w:r>
+      <w:r>
+        <w:rPr>
+          <w:lang w:val="fr-CA"/>
+        </w:rPr>
+        <w:t>.</w:t>
+      </w:r>
+      <w:r>
+        <w:rPr>
+          <w:lang w:val="fr-CA"/>
+        </w:rPr>
         <w:t xml:space="preserve"> </w:t>
       </w:r>
-      <w:r>
-        <w:rPr>
-          <w:lang w:val="fr-CA"/>
-        </w:rPr>
-        <w:t xml:space="preserve">sci. </w:t>
-      </w:r>
-      <w:proofErr w:type="gramStart"/>
-      <w:r>
-        <w:rPr>
-          <w:lang w:val="fr-CA"/>
-        </w:rPr>
-        <w:t>du</w:t>
-      </w:r>
-      <w:proofErr w:type="gramEnd"/>
-      <w:r>
-        <w:rPr>
-          <w:lang w:val="fr-CA"/>
-        </w:rPr>
-        <w:t xml:space="preserve"> MPO</w:t>
-      </w:r>
-      <w:r>
-        <w:rPr>
-          <w:lang w:val="fr-CA"/>
-        </w:rPr>
-        <w:t>.</w:t>
-      </w:r>
-      <w:r>
-        <w:rPr>
-          <w:lang w:val="fr-CA"/>
-        </w:rPr>
-        <w:t xml:space="preserve"> Rép. </w:t>
-      </w:r>
-      <w:proofErr w:type="gramStart"/>
-      <w:r>
-        <w:rPr>
-          <w:lang w:val="fr-CA"/>
-        </w:rPr>
-        <w:t>des</w:t>
-      </w:r>
-      <w:proofErr w:type="gramEnd"/>
-      <w:r>
-        <w:rPr>
-          <w:lang w:val="fr-CA"/>
-        </w:rPr>
-        <w:t xml:space="preserve"> Sci. </w:t>
-      </w:r>
-      <w:r>
-        <w:rPr>
-          <w:lang w:val="fr-CA"/>
-        </w:rPr>
-        <w:t>202</w:t>
-      </w:r>
-      <w:r>
-        <w:rPr>
-          <w:lang w:val="fr-CA"/>
-        </w:rPr>
-        <w:t>6</w:t>
-      </w:r>
-      <w:r>
-        <w:rPr>
-          <w:lang w:val="fr-CA"/>
-        </w:rPr>
-        <w:t>/</w:t>
-      </w:r>
-      <w:r>
-        <w:rPr>
-          <w:color w:val="4F81BD" w:themeColor="accent1"/>
-          <w:lang w:val="fr-CA"/>
-        </w:rPr>
-        <w:t>nnn</w:t>
-      </w:r>
-      <w:r>
-        <w:rPr>
-          <w:lang w:val="fr-CA"/>
-        </w:rPr>
-        <w:t>.</w:t>
-      </w:r>
-      <w:r>
-        <w:rPr>
-          <w:lang w:val="fr-CA"/>
-        </w:rPr>
-        <w:t xml:space="preserve"> </w:t>
-      </w:r>
       <w:bookmarkStart w:id="5" w:name="_Hlk215580590"/>
-      <w:proofErr w:type="gramStart"/>
       <w:r>
         <w:rPr>
           <w:lang w:val="fr-FR"/>
         </w:rPr>
-        <w:t>doi</w:t>
-      </w:r>
-      <w:proofErr w:type="gramEnd"/>
-      <w:r>
-        <w:rPr>
-          <w:lang w:val="fr-FR"/>
-        </w:rPr>
-        <w:t> </w:t>
+        <w:t>doi </w:t>
       </w:r>
       <w:r>
         <w:rPr>
@@ -4481,6 +4405,120 @@
     </w:lvl>
   </w:abstractNum>
   <w:abstractNum w:abstractNumId="24" w15:restartNumberingAfterBreak="0">
+    <w:nsid w:val="5E1A4A94"/>
+    <w:multiLevelType w:val="multilevel"/>
+    <w:tmpl w:val="BDE0B074"/>
+    <w:styleLink w:val="olstyle"/>
+    <w:lvl w:ilvl="0">
+      <w:start w:val="1"/>
+      <w:numFmt w:val="decimal"/>
+      <w:lvlText w:val="%1."/>
+      <w:lvlJc w:val="left"/>
+      <w:pPr>
+        <w:ind w:left="360" w:hanging="360"/>
+      </w:pPr>
+      <w:rPr>
+        <w:rFonts w:hint="default"/>
+      </w:rPr>
+    </w:lvl>
+    <w:lvl w:ilvl="1">
+      <w:start w:val="1"/>
+      <w:numFmt w:val="lowerLetter"/>
+      <w:lvlText w:val="%2."/>
+      <w:lvlJc w:val="left"/>
+      <w:pPr>
+        <w:ind w:left="720" w:hanging="360"/>
+      </w:pPr>
+      <w:rPr>
+        <w:rFonts w:hint="default"/>
+      </w:rPr>
+    </w:lvl>
+    <w:lvl w:ilvl="2">
+      <w:start w:val="1"/>
+      <w:numFmt w:val="lowerRoman"/>
+      <w:lvlText w:val="%3."/>
+      <w:lvlJc w:val="right"/>
+      <w:pPr>
+        <w:ind w:left="1080" w:hanging="360"/>
+      </w:pPr>
+      <w:rPr>
+        <w:rFonts w:hint="default"/>
+      </w:rPr>
+    </w:lvl>
+    <w:lvl w:ilvl="3">
+      <w:start w:val="1"/>
+      <w:numFmt w:val="decimal"/>
+      <w:lvlText w:val="%4."/>
+      <w:lvlJc w:val="left"/>
+      <w:pPr>
+        <w:ind w:left="1440" w:hanging="360"/>
+      </w:pPr>
+      <w:rPr>
+        <w:rFonts w:hint="default"/>
+      </w:rPr>
+    </w:lvl>
+    <w:lvl w:ilvl="4">
+      <w:start w:val="1"/>
+      <w:numFmt w:val="lowerLetter"/>
+      <w:lvlText w:val="%5."/>
+      <w:lvlJc w:val="left"/>
+      <w:pPr>
+        <w:ind w:left="1800" w:hanging="360"/>
+      </w:pPr>
+      <w:rPr>
+        <w:rFonts w:hint="default"/>
+      </w:rPr>
+    </w:lvl>
+    <w:lvl w:ilvl="5">
+      <w:start w:val="1"/>
+      <w:numFmt w:val="lowerRoman"/>
+      <w:lvlText w:val="%6."/>
+      <w:lvlJc w:val="right"/>
+      <w:pPr>
+        <w:ind w:left="2160" w:hanging="360"/>
+      </w:pPr>
+      <w:rPr>
+        <w:rFonts w:hint="default"/>
+      </w:rPr>
+    </w:lvl>
+    <w:lvl w:ilvl="6">
+      <w:start w:val="1"/>
+      <w:numFmt w:val="decimal"/>
+      <w:lvlText w:val="%7."/>
+      <w:lvlJc w:val="left"/>
+      <w:pPr>
+        <w:ind w:left="2520" w:hanging="360"/>
+      </w:pPr>
+      <w:rPr>
+        <w:rFonts w:hint="default"/>
+      </w:rPr>
+    </w:lvl>
+    <w:lvl w:ilvl="7">
+      <w:start w:val="1"/>
+      <w:numFmt w:val="lowerLetter"/>
+      <w:lvlText w:val="%8."/>
+      <w:lvlJc w:val="left"/>
+      <w:pPr>
+        <w:ind w:left="2880" w:hanging="360"/>
+      </w:pPr>
+      <w:rPr>
+        <w:rFonts w:hint="default"/>
+      </w:rPr>
+    </w:lvl>
+    <w:lvl w:ilvl="8">
+      <w:start w:val="1"/>
+      <w:numFmt w:val="lowerRoman"/>
+      <w:lvlText w:val="%9."/>
+      <w:lvlJc w:val="right"/>
+      <w:pPr>
+        <w:ind w:left="3240" w:hanging="360"/>
+      </w:pPr>
+      <w:rPr>
+        <w:rFonts w:hint="default"/>
+      </w:rPr>
+    </w:lvl>
+  </w:abstractNum>
+  <w:abstractNum w:abstractNumId="25" w15:restartNumberingAfterBreak="0">
     <w:nsid w:val="628A010C"/>
     <w:multiLevelType w:val="hybridMultilevel"/>
     <w:tmpl w:val="8C90F688"/>
@@ -4620,7 +4658,121 @@
       </w:rPr>
     </w:lvl>
   </w:abstractNum>
-  <w:abstractNum w:abstractNumId="25" w15:restartNumberingAfterBreak="0">
+  <w:abstractNum w:abstractNumId="26" w15:restartNumberingAfterBreak="0">
+    <w:nsid w:val="6B584AAA"/>
+    <w:multiLevelType w:val="multilevel"/>
+    <w:tmpl w:val="D048E428"/>
+    <w:styleLink w:val="ulstyle"/>
+    <w:lvl w:ilvl="0">
+      <w:start w:val="1"/>
+      <w:numFmt w:val="bullet"/>
+      <w:lvlText w:val=""/>
+      <w:lvlJc w:val="left"/>
+      <w:pPr>
+        <w:ind w:left="360" w:hanging="360"/>
+      </w:pPr>
+      <w:rPr>
+        <w:rFonts w:ascii="Symbol" w:hAnsi="Symbol" w:hint="default"/>
+      </w:rPr>
+    </w:lvl>
+    <w:lvl w:ilvl="1">
+      <w:start w:val="1"/>
+      <w:numFmt w:val="bullet"/>
+      <w:lvlText w:val="o"/>
+      <w:lvlJc w:val="left"/>
+      <w:pPr>
+        <w:ind w:left="720" w:hanging="360"/>
+      </w:pPr>
+      <w:rPr>
+        <w:rFonts w:ascii="Courier New" w:hAnsi="Courier New" w:cs="Courier New" w:hint="default"/>
+      </w:rPr>
+    </w:lvl>
+    <w:lvl w:ilvl="2">
+      <w:start w:val="1"/>
+      <w:numFmt w:val="bullet"/>
+      <w:lvlText w:val=""/>
+      <w:lvlJc w:val="left"/>
+      <w:pPr>
+        <w:ind w:left="1080" w:hanging="360"/>
+      </w:pPr>
+      <w:rPr>
+        <w:rFonts w:ascii="Wingdings" w:hAnsi="Wingdings" w:hint="default"/>
+      </w:rPr>
+    </w:lvl>
+    <w:lvl w:ilvl="3">
+      <w:start w:val="1"/>
+      <w:numFmt w:val="bullet"/>
+      <w:lvlText w:val=""/>
+      <w:lvlJc w:val="left"/>
+      <w:pPr>
+        <w:ind w:left="1440" w:hanging="360"/>
+      </w:pPr>
+      <w:rPr>
+        <w:rFonts w:ascii="Symbol" w:hAnsi="Symbol" w:hint="default"/>
+      </w:rPr>
+    </w:lvl>
+    <w:lvl w:ilvl="4">
+      <w:start w:val="1"/>
+      <w:numFmt w:val="bullet"/>
+      <w:lvlText w:val="o"/>
+      <w:lvlJc w:val="left"/>
+      <w:pPr>
+        <w:ind w:left="1800" w:hanging="360"/>
+      </w:pPr>
+      <w:rPr>
+        <w:rFonts w:ascii="Courier New" w:hAnsi="Courier New" w:cs="Courier New" w:hint="default"/>
+      </w:rPr>
+    </w:lvl>
+    <w:lvl w:ilvl="5">
+      <w:start w:val="1"/>
+      <w:numFmt w:val="bullet"/>
+      <w:lvlText w:val=""/>
+      <w:lvlJc w:val="left"/>
+      <w:pPr>
+        <w:ind w:left="2160" w:hanging="360"/>
+      </w:pPr>
+      <w:rPr>
+        <w:rFonts w:ascii="Wingdings" w:hAnsi="Wingdings" w:hint="default"/>
+      </w:rPr>
+    </w:lvl>
+    <w:lvl w:ilvl="6">
+      <w:start w:val="1"/>
+      <w:numFmt w:val="bullet"/>
+      <w:lvlText w:val=""/>
+      <w:lvlJc w:val="left"/>
+      <w:pPr>
+        <w:ind w:left="2520" w:hanging="360"/>
+      </w:pPr>
+      <w:rPr>
+        <w:rFonts w:ascii="Symbol" w:hAnsi="Symbol" w:hint="default"/>
+      </w:rPr>
+    </w:lvl>
+    <w:lvl w:ilvl="7">
+      <w:start w:val="1"/>
+      <w:numFmt w:val="bullet"/>
+      <w:lvlText w:val="o"/>
+      <w:lvlJc w:val="left"/>
+      <w:pPr>
+        <w:ind w:left="2880" w:hanging="360"/>
+      </w:pPr>
+      <w:rPr>
+        <w:rFonts w:ascii="Courier New" w:hAnsi="Courier New" w:cs="Courier New" w:hint="default"/>
+      </w:rPr>
+    </w:lvl>
+    <w:lvl w:ilvl="8">
+      <w:start w:val="1"/>
+      <w:numFmt w:val="bullet"/>
+      <w:lvlText w:val=""/>
+      <w:lvlJc w:val="left"/>
+      <w:pPr>
+        <w:ind w:left="3240" w:hanging="360"/>
+      </w:pPr>
+      <w:rPr>
+        <w:rFonts w:ascii="Wingdings" w:hAnsi="Wingdings" w:hint="default"/>
+      </w:rPr>
+    </w:lvl>
+  </w:abstractNum>
+  <w:abstractNum w:abstractNumId="27" w15:restartNumberingAfterBreak="0">
     <w:nsid w:val="6FDE7724"/>
     <w:multiLevelType w:val="hybridMultilevel"/>
     <w:tmpl w:val="C00AEBD2"/>
@@ -4760,7 +4912,7 @@
       </w:rPr>
     </w:lvl>
   </w:abstractNum>
-  <w:abstractNum w:abstractNumId="26" w15:restartNumberingAfterBreak="0">
+  <w:abstractNum w:abstractNumId="28" w15:restartNumberingAfterBreak="0">
     <w:nsid w:val="72916972"/>
     <w:multiLevelType w:val="multilevel"/>
     <w:tmpl w:val="C00AEBD2"/>
@@ -4943,7 +5095,7 @@
     <w:abstractNumId w:val="19"/>
   </w:num>
   <w:num w:numId="10" w16cid:durableId="1378162468">
-    <w:abstractNumId w:val="24"/>
+    <w:abstractNumId w:val="25"/>
   </w:num>
   <w:num w:numId="11" w16cid:durableId="910655050">
     <w:abstractNumId w:val="9"/>
@@ -4982,10 +5134,10 @@
     <w:abstractNumId w:val="15"/>
   </w:num>
   <w:num w:numId="23" w16cid:durableId="1587496027">
-    <w:abstractNumId w:val="25"/>
+    <w:abstractNumId w:val="27"/>
   </w:num>
   <w:num w:numId="24" w16cid:durableId="1393891864">
-    <w:abstractNumId w:val="26"/>
+    <w:abstractNumId w:val="28"/>
   </w:num>
   <w:num w:numId="25" w16cid:durableId="1948073410">
     <w:abstractNumId w:val="18"/>
@@ -5010,6 +5162,12 @@
   </w:num>
   <w:num w:numId="32" w16cid:durableId="713240481">
     <w:abstractNumId w:val="23"/>
+  </w:num>
+  <w:num w:numId="33" w16cid:durableId="797067583">
+    <w:abstractNumId w:val="26"/>
+  </w:num>
+  <w:num w:numId="34" w16cid:durableId="1496917012">
+    <w:abstractNumId w:val="24"/>
   </w:num>
 </w:numbering>
 </file>
@@ -6307,6 +6465,26 @@
       <w:lang w:val="en-CA"/>
     </w:rPr>
   </w:style>
+  <w:style w:type="numbering" w:customStyle="1" w:styleId="ulstyle">
+    <w:name w:val="ul style"/>
+    <w:uiPriority w:val="99"/>
+    <w:rsid w:val="0073436B"/>
+    <w:pPr>
+      <w:numPr>
+        <w:numId w:val="33"/>
+      </w:numPr>
+    </w:pPr>
+  </w:style>
+  <w:style w:type="numbering" w:customStyle="1" w:styleId="olstyle">
+    <w:name w:val="ol style"/>
+    <w:uiPriority w:val="99"/>
+    <w:rsid w:val="0073436B"/>
+    <w:pPr>
+      <w:numPr>
+        <w:numId w:val="34"/>
+      </w:numPr>
+    </w:pPr>
+  </w:style>
 </w:styles>
 </file>
 
@@ -6594,20 +6772,12 @@
 </file>
 
 <file path=customXml/item1.xml><?xml version="1.0" encoding="utf-8"?>
-<p:properties xmlns:p="http://schemas.microsoft.com/office/2006/metadata/properties" xmlns:xsi="http://www.w3.org/2001/XMLSchema-instance" xmlns:pc="http://schemas.microsoft.com/office/infopath/2007/PartnerControls">
-  <documentManagement>
-    <Status xmlns="92d68da2-9c2d-44ac-ae06-3f4a753b389d" xsi:nil="true"/>
-    <test xmlns="92d68da2-9c2d-44ac-ae06-3f4a753b389d" xsi:nil="true"/>
-    <DocumentType xmlns="92d68da2-9c2d-44ac-ae06-3f4a753b389d" xsi:nil="true"/>
-    <lcf76f155ced4ddcb4097134ff3c332f xmlns="92d68da2-9c2d-44ac-ae06-3f4a753b389d">
-      <Terms xmlns="http://schemas.microsoft.com/office/infopath/2007/PartnerControls"/>
-    </lcf76f155ced4ddcb4097134ff3c332f>
-    <Region xmlns="92d68da2-9c2d-44ac-ae06-3f4a753b389d" xsi:nil="true"/>
-    <TaxCatchAll xmlns="af38042d-bccf-41a5-8261-f25f76403ccf" xsi:nil="true"/>
-    <_ip_UnifiedCompliancePolicyUIAction xmlns="http://schemas.microsoft.com/sharepoint/v3" xsi:nil="true"/>
-    <_ip_UnifiedCompliancePolicyProperties xmlns="http://schemas.microsoft.com/sharepoint/v3" xsi:nil="true"/>
-  </documentManagement>
-</p:properties>
+<?mso-contentType ?>
+<FormTemplates xmlns="http://schemas.microsoft.com/sharepoint/v3/contenttype/forms">
+  <Display>DocumentLibraryForm</Display>
+  <Edit>DocumentLibraryForm</Edit>
+  <New>DocumentLibraryForm</New>
+</FormTemplates>
 </file>
 
 <file path=customXml/item2.xml><?xml version="1.0" encoding="utf-8"?>
@@ -6899,12 +7069,20 @@
 </file>
 
 <file path=customXml/item3.xml><?xml version="1.0" encoding="utf-8"?>
-<?mso-contentType ?>
-<FormTemplates xmlns="http://schemas.microsoft.com/sharepoint/v3/contenttype/forms">
-  <Display>DocumentLibraryForm</Display>
-  <Edit>DocumentLibraryForm</Edit>
-  <New>DocumentLibraryForm</New>
-</FormTemplates>
+<p:properties xmlns:p="http://schemas.microsoft.com/office/2006/metadata/properties" xmlns:xsi="http://www.w3.org/2001/XMLSchema-instance" xmlns:pc="http://schemas.microsoft.com/office/infopath/2007/PartnerControls">
+  <documentManagement>
+    <Status xmlns="92d68da2-9c2d-44ac-ae06-3f4a753b389d" xsi:nil="true"/>
+    <test xmlns="92d68da2-9c2d-44ac-ae06-3f4a753b389d" xsi:nil="true"/>
+    <DocumentType xmlns="92d68da2-9c2d-44ac-ae06-3f4a753b389d" xsi:nil="true"/>
+    <lcf76f155ced4ddcb4097134ff3c332f xmlns="92d68da2-9c2d-44ac-ae06-3f4a753b389d">
+      <Terms xmlns="http://schemas.microsoft.com/office/infopath/2007/PartnerControls"/>
+    </lcf76f155ced4ddcb4097134ff3c332f>
+    <Region xmlns="92d68da2-9c2d-44ac-ae06-3f4a753b389d" xsi:nil="true"/>
+    <TaxCatchAll xmlns="af38042d-bccf-41a5-8261-f25f76403ccf" xsi:nil="true"/>
+    <_ip_UnifiedCompliancePolicyUIAction xmlns="http://schemas.microsoft.com/sharepoint/v3" xsi:nil="true"/>
+    <_ip_UnifiedCompliancePolicyProperties xmlns="http://schemas.microsoft.com/sharepoint/v3" xsi:nil="true"/>
+  </documentManagement>
+</p:properties>
 </file>
 
 <file path=customXml/item4.xml><?xml version="1.0" encoding="utf-8"?>
@@ -6912,13 +7090,9 @@
 </file>
 
 <file path=customXml/itemProps1.xml><?xml version="1.0" encoding="utf-8"?>
-<ds:datastoreItem xmlns:ds="http://schemas.openxmlformats.org/officeDocument/2006/customXml" ds:itemID="{4603D7A3-EF4E-4B9C-BF8C-67628FBA515B}">
+<ds:datastoreItem xmlns:ds="http://schemas.openxmlformats.org/officeDocument/2006/customXml" ds:itemID="{FE5ADF7B-AED6-456C-BC7B-A672017909C5}">
   <ds:schemaRefs>
-    <ds:schemaRef ds:uri="http://schemas.microsoft.com/office/2006/metadata/properties"/>
-    <ds:schemaRef ds:uri="http://schemas.microsoft.com/office/infopath/2007/PartnerControls"/>
-    <ds:schemaRef ds:uri="92d68da2-9c2d-44ac-ae06-3f4a753b389d"/>
-    <ds:schemaRef ds:uri="af38042d-bccf-41a5-8261-f25f76403ccf"/>
-    <ds:schemaRef ds:uri="http://schemas.microsoft.com/sharepoint/v3"/>
+    <ds:schemaRef ds:uri="http://schemas.microsoft.com/sharepoint/v3/contenttype/forms"/>
   </ds:schemaRefs>
 </ds:datastoreItem>
 </file>
@@ -6944,9 +7118,13 @@
 </file>
 
 <file path=customXml/itemProps3.xml><?xml version="1.0" encoding="utf-8"?>
-<ds:datastoreItem xmlns:ds="http://schemas.openxmlformats.org/officeDocument/2006/customXml" ds:itemID="{FE5ADF7B-AED6-456C-BC7B-A672017909C5}">
+<ds:datastoreItem xmlns:ds="http://schemas.openxmlformats.org/officeDocument/2006/customXml" ds:itemID="{4603D7A3-EF4E-4B9C-BF8C-67628FBA515B}">
   <ds:schemaRefs>
-    <ds:schemaRef ds:uri="http://schemas.microsoft.com/sharepoint/v3/contenttype/forms"/>
+    <ds:schemaRef ds:uri="http://schemas.microsoft.com/office/2006/metadata/properties"/>
+    <ds:schemaRef ds:uri="http://schemas.microsoft.com/office/infopath/2007/PartnerControls"/>
+    <ds:schemaRef ds:uri="92d68da2-9c2d-44ac-ae06-3f4a753b389d"/>
+    <ds:schemaRef ds:uri="af38042d-bccf-41a5-8261-f25f76403ccf"/>
+    <ds:schemaRef ds:uri="http://schemas.microsoft.com/sharepoint/v3"/>
   </ds:schemaRefs>
 </ds:datastoreItem>
 </file>

</xml_diff>